<commit_message>
Skill attributes UI and system and exp system
</commit_message>
<xml_diff>
--- a/Docs/Playtest 1.docx
+++ b/Docs/Playtest 1.docx
@@ -101,6 +101,40 @@
           <w:szCs w:val="24"/>
         </w:rPr>
         <w:t>Hamster jumps too high.</w:t>
+      </w:r>
+    </w:p>
+    <w:p>
+      <w:pPr>
+        <w:pStyle w:val="ListParagraph"/>
+        <w:numPr>
+          <w:ilvl w:val="0"/>
+          <w:numId w:val="1"/>
+        </w:numPr>
+        <w:rPr>
+          <w:sz w:val="24"/>
+          <w:szCs w:val="24"/>
+        </w:rPr>
+      </w:pPr>
+      <w:r>
+        <w:rPr>
+          <w:sz w:val="24"/>
+          <w:szCs w:val="24"/>
+        </w:rPr>
+        <w:t>Darken non selected party member</w:t>
+      </w:r>
+      <w:r>
+        <w:rPr>
+          <w:sz w:val="24"/>
+          <w:szCs w:val="24"/>
+        </w:rPr>
+        <w:t>s</w:t>
+      </w:r>
+      <w:r>
+        <w:rPr>
+          <w:sz w:val="24"/>
+          <w:szCs w:val="24"/>
+        </w:rPr>
+        <w:t xml:space="preserve"> in party UI. – Found it a bit confusing with just the background colour change.</w:t>
       </w:r>
     </w:p>
     <w:p>

</xml_diff>

<commit_message>
Can continue dialogue with mouse click, tidy up player actions enabling and disabling
</commit_message>
<xml_diff>
--- a/Docs/Playtest 1.docx
+++ b/Docs/Playtest 1.docx
@@ -80,7 +80,7 @@
           <w:sz w:val="24"/>
           <w:szCs w:val="24"/>
         </w:rPr>
-        <w:t>Make inventory system navigable using the WASD keys.</w:t>
+        <w:t>Hamster jumps too high.</w:t>
       </w:r>
     </w:p>
     <w:p>
@@ -100,7 +100,7 @@
           <w:sz w:val="24"/>
           <w:szCs w:val="24"/>
         </w:rPr>
-        <w:t>Hamster jumps too high.</w:t>
+        <w:t>Only show new game warning if save game exists – not on first start.</w:t>
       </w:r>
     </w:p>
     <w:p>
@@ -120,38 +120,68 @@
           <w:sz w:val="24"/>
           <w:szCs w:val="24"/>
         </w:rPr>
-        <w:t>Darken non selected party member</w:t>
-      </w:r>
-      <w:r>
-        <w:rPr>
-          <w:sz w:val="24"/>
-          <w:szCs w:val="24"/>
-        </w:rPr>
-        <w:t>s</w:t>
-      </w:r>
-      <w:r>
-        <w:rPr>
-          <w:sz w:val="24"/>
-          <w:szCs w:val="24"/>
-        </w:rPr>
-        <w:t xml:space="preserve"> in party UI. – Found it a bit confusing with just the background colour change.</w:t>
+        <w:t>Make Q, E and arrow images in the tab menu into buttons.</w:t>
       </w:r>
     </w:p>
     <w:p>
       <w:pPr>
-        <w:rPr>
-          <w:sz w:val="24"/>
-          <w:szCs w:val="24"/>
-        </w:rPr>
-      </w:pPr>
+        <w:pStyle w:val="ListParagraph"/>
+        <w:numPr>
+          <w:ilvl w:val="0"/>
+          <w:numId w:val="1"/>
+        </w:numPr>
+        <w:rPr>
+          <w:sz w:val="24"/>
+          <w:szCs w:val="24"/>
+        </w:rPr>
+      </w:pPr>
+      <w:r>
+        <w:rPr>
+          <w:sz w:val="24"/>
+          <w:szCs w:val="24"/>
+        </w:rPr>
+        <w:t>Add mouse click as a key bind for continuing dialogue.</w:t>
+      </w:r>
     </w:p>
     <w:p>
       <w:pPr>
-        <w:rPr>
-          <w:sz w:val="24"/>
-          <w:szCs w:val="24"/>
-        </w:rPr>
-      </w:pPr>
+        <w:pStyle w:val="ListParagraph"/>
+        <w:numPr>
+          <w:ilvl w:val="0"/>
+          <w:numId w:val="1"/>
+        </w:numPr>
+        <w:rPr>
+          <w:sz w:val="24"/>
+          <w:szCs w:val="24"/>
+        </w:rPr>
+      </w:pPr>
+      <w:r>
+        <w:rPr>
+          <w:sz w:val="24"/>
+          <w:szCs w:val="24"/>
+        </w:rPr>
+        <w:t>Make inventory slots navigable with keyboard.</w:t>
+      </w:r>
+    </w:p>
+    <w:p>
+      <w:pPr>
+        <w:pStyle w:val="ListParagraph"/>
+        <w:numPr>
+          <w:ilvl w:val="0"/>
+          <w:numId w:val="1"/>
+        </w:numPr>
+        <w:rPr>
+          <w:sz w:val="24"/>
+          <w:szCs w:val="24"/>
+        </w:rPr>
+      </w:pPr>
+      <w:r>
+        <w:rPr>
+          <w:sz w:val="24"/>
+          <w:szCs w:val="24"/>
+        </w:rPr>
+        <w:t>Darken non selected party members in party UI. – Found it a bit confusing with just the background colour change.</w:t>
+      </w:r>
     </w:p>
     <w:p>
       <w:pPr>
@@ -255,6 +285,345 @@
 <file path=word/numbering.xml><?xml version="1.0" encoding="utf-8"?>
 <w:numbering xmlns:wpc="http://schemas.microsoft.com/office/word/2010/wordprocessingCanvas" xmlns:cx="http://schemas.microsoft.com/office/drawing/2014/chartex" xmlns:cx1="http://schemas.microsoft.com/office/drawing/2015/9/8/chartex" xmlns:cx2="http://schemas.microsoft.com/office/drawing/2015/10/21/chartex" xmlns:cx3="http://schemas.microsoft.com/office/drawing/2016/5/9/chartex" xmlns:cx4="http://schemas.microsoft.com/office/drawing/2016/5/10/chartex" xmlns:cx5="http://schemas.microsoft.com/office/drawing/2016/5/11/chartex" xmlns:cx6="http://schemas.microsoft.com/office/drawing/2016/5/12/chartex" xmlns:cx7="http://schemas.microsoft.com/office/drawing/2016/5/13/chartex" xmlns:cx8="http://schemas.microsoft.com/office/drawing/2016/5/14/chartex" xmlns:mc="http://schemas.openxmlformats.org/markup-compatibility/2006" xmlns:aink="http://schemas.microsoft.com/office/drawing/2016/ink" xmlns:am3d="http://schemas.microsoft.com/office/drawing/2017/model3d" xmlns:o="urn:schemas-microsoft-com:office:office" xmlns:oel="http://schemas.microsoft.com/office/2019/extlst" xmlns:r="http://schemas.openxmlformats.org/officeDocument/2006/relationships" xmlns:m="http://schemas.openxmlformats.org/officeDocument/2006/math" xmlns:v="urn:schemas-microsoft-com:vml" xmlns:wp14="http://schemas.microsoft.com/office/word/2010/wordprocessingDrawing" xmlns:wp="http://schemas.openxmlformats.org/drawingml/2006/wordprocessingDrawing" xmlns:w10="urn:schemas-microsoft-com:office:word" xmlns:w="http://schemas.openxmlformats.org/wordprocessingml/2006/main" xmlns:w14="http://schemas.microsoft.com/office/word/2010/wordml" xmlns:w15="http://schemas.microsoft.com/office/word/2012/wordml" xmlns:w16cex="http://schemas.microsoft.com/office/word/2018/wordml/cex" xmlns:w16cid="http://schemas.microsoft.com/office/word/2016/wordml/cid" xmlns:w16="http://schemas.microsoft.com/office/word/2018/wordml" xmlns:w16du="http://schemas.microsoft.com/office/word/2023/wordml/word16du" xmlns:w16sdtdh="http://schemas.microsoft.com/office/word/2020/wordml/sdtdatahash" xmlns:w16sdtfl="http://schemas.microsoft.com/office/word/2024/wordml/sdtformatlock" xmlns:w16se="http://schemas.microsoft.com/office/word/2015/wordml/symex" xmlns:wpg="http://schemas.microsoft.com/office/word/2010/wordprocessingGroup" xmlns:wpi="http://schemas.microsoft.com/office/word/2010/wordprocessingInk" xmlns:wne="http://schemas.microsoft.com/office/word/2006/wordml" xmlns:wps="http://schemas.microsoft.com/office/word/2010/wordprocessingShape" mc:Ignorable="w14 w15 w16se w16cid w16 w16cex w16sdtdh w16sdtfl w16du wp14">
   <w:abstractNum w:abstractNumId="0" w15:restartNumberingAfterBreak="0">
+    <w:nsid w:val="02301856"/>
+    <w:multiLevelType w:val="hybridMultilevel"/>
+    <w:tmpl w:val="8BEC52EA"/>
+    <w:lvl w:ilvl="0" w:tplc="18090003">
+      <w:start w:val="1"/>
+      <w:numFmt w:val="bullet"/>
+      <w:lvlText w:val="o"/>
+      <w:lvlJc w:val="left"/>
+      <w:pPr>
+        <w:ind w:left="1440" w:hanging="360"/>
+      </w:pPr>
+      <w:rPr>
+        <w:rFonts w:ascii="Courier New" w:hAnsi="Courier New" w:cs="Courier New" w:hint="default"/>
+      </w:rPr>
+    </w:lvl>
+    <w:lvl w:ilvl="1" w:tplc="18090003" w:tentative="1">
+      <w:start w:val="1"/>
+      <w:numFmt w:val="bullet"/>
+      <w:lvlText w:val="o"/>
+      <w:lvlJc w:val="left"/>
+      <w:pPr>
+        <w:ind w:left="2160" w:hanging="360"/>
+      </w:pPr>
+      <w:rPr>
+        <w:rFonts w:ascii="Courier New" w:hAnsi="Courier New" w:cs="Courier New" w:hint="default"/>
+      </w:rPr>
+    </w:lvl>
+    <w:lvl w:ilvl="2" w:tplc="18090005" w:tentative="1">
+      <w:start w:val="1"/>
+      <w:numFmt w:val="bullet"/>
+      <w:lvlText w:val=""/>
+      <w:lvlJc w:val="left"/>
+      <w:pPr>
+        <w:ind w:left="2880" w:hanging="360"/>
+      </w:pPr>
+      <w:rPr>
+        <w:rFonts w:ascii="Wingdings" w:hAnsi="Wingdings" w:hint="default"/>
+      </w:rPr>
+    </w:lvl>
+    <w:lvl w:ilvl="3" w:tplc="18090001" w:tentative="1">
+      <w:start w:val="1"/>
+      <w:numFmt w:val="bullet"/>
+      <w:lvlText w:val=""/>
+      <w:lvlJc w:val="left"/>
+      <w:pPr>
+        <w:ind w:left="3600" w:hanging="360"/>
+      </w:pPr>
+      <w:rPr>
+        <w:rFonts w:ascii="Symbol" w:hAnsi="Symbol" w:hint="default"/>
+      </w:rPr>
+    </w:lvl>
+    <w:lvl w:ilvl="4" w:tplc="18090003" w:tentative="1">
+      <w:start w:val="1"/>
+      <w:numFmt w:val="bullet"/>
+      <w:lvlText w:val="o"/>
+      <w:lvlJc w:val="left"/>
+      <w:pPr>
+        <w:ind w:left="4320" w:hanging="360"/>
+      </w:pPr>
+      <w:rPr>
+        <w:rFonts w:ascii="Courier New" w:hAnsi="Courier New" w:cs="Courier New" w:hint="default"/>
+      </w:rPr>
+    </w:lvl>
+    <w:lvl w:ilvl="5" w:tplc="18090005" w:tentative="1">
+      <w:start w:val="1"/>
+      <w:numFmt w:val="bullet"/>
+      <w:lvlText w:val=""/>
+      <w:lvlJc w:val="left"/>
+      <w:pPr>
+        <w:ind w:left="5040" w:hanging="360"/>
+      </w:pPr>
+      <w:rPr>
+        <w:rFonts w:ascii="Wingdings" w:hAnsi="Wingdings" w:hint="default"/>
+      </w:rPr>
+    </w:lvl>
+    <w:lvl w:ilvl="6" w:tplc="18090001" w:tentative="1">
+      <w:start w:val="1"/>
+      <w:numFmt w:val="bullet"/>
+      <w:lvlText w:val=""/>
+      <w:lvlJc w:val="left"/>
+      <w:pPr>
+        <w:ind w:left="5760" w:hanging="360"/>
+      </w:pPr>
+      <w:rPr>
+        <w:rFonts w:ascii="Symbol" w:hAnsi="Symbol" w:hint="default"/>
+      </w:rPr>
+    </w:lvl>
+    <w:lvl w:ilvl="7" w:tplc="18090003" w:tentative="1">
+      <w:start w:val="1"/>
+      <w:numFmt w:val="bullet"/>
+      <w:lvlText w:val="o"/>
+      <w:lvlJc w:val="left"/>
+      <w:pPr>
+        <w:ind w:left="6480" w:hanging="360"/>
+      </w:pPr>
+      <w:rPr>
+        <w:rFonts w:ascii="Courier New" w:hAnsi="Courier New" w:cs="Courier New" w:hint="default"/>
+      </w:rPr>
+    </w:lvl>
+    <w:lvl w:ilvl="8" w:tplc="18090005" w:tentative="1">
+      <w:start w:val="1"/>
+      <w:numFmt w:val="bullet"/>
+      <w:lvlText w:val=""/>
+      <w:lvlJc w:val="left"/>
+      <w:pPr>
+        <w:ind w:left="7200" w:hanging="360"/>
+      </w:pPr>
+      <w:rPr>
+        <w:rFonts w:ascii="Wingdings" w:hAnsi="Wingdings" w:hint="default"/>
+      </w:rPr>
+    </w:lvl>
+  </w:abstractNum>
+  <w:abstractNum w:abstractNumId="1" w15:restartNumberingAfterBreak="0">
+    <w:nsid w:val="1A64238C"/>
+    <w:multiLevelType w:val="hybridMultilevel"/>
+    <w:tmpl w:val="D7FEC2EC"/>
+    <w:lvl w:ilvl="0" w:tplc="18090001">
+      <w:start w:val="1"/>
+      <w:numFmt w:val="bullet"/>
+      <w:lvlText w:val=""/>
+      <w:lvlJc w:val="left"/>
+      <w:pPr>
+        <w:ind w:left="720" w:hanging="360"/>
+      </w:pPr>
+      <w:rPr>
+        <w:rFonts w:ascii="Symbol" w:hAnsi="Symbol" w:hint="default"/>
+      </w:rPr>
+    </w:lvl>
+    <w:lvl w:ilvl="1" w:tplc="18090003" w:tentative="1">
+      <w:start w:val="1"/>
+      <w:numFmt w:val="bullet"/>
+      <w:lvlText w:val="o"/>
+      <w:lvlJc w:val="left"/>
+      <w:pPr>
+        <w:ind w:left="1440" w:hanging="360"/>
+      </w:pPr>
+      <w:rPr>
+        <w:rFonts w:ascii="Courier New" w:hAnsi="Courier New" w:cs="Courier New" w:hint="default"/>
+      </w:rPr>
+    </w:lvl>
+    <w:lvl w:ilvl="2" w:tplc="18090005" w:tentative="1">
+      <w:start w:val="1"/>
+      <w:numFmt w:val="bullet"/>
+      <w:lvlText w:val=""/>
+      <w:lvlJc w:val="left"/>
+      <w:pPr>
+        <w:ind w:left="2160" w:hanging="360"/>
+      </w:pPr>
+      <w:rPr>
+        <w:rFonts w:ascii="Wingdings" w:hAnsi="Wingdings" w:hint="default"/>
+      </w:rPr>
+    </w:lvl>
+    <w:lvl w:ilvl="3" w:tplc="18090001" w:tentative="1">
+      <w:start w:val="1"/>
+      <w:numFmt w:val="bullet"/>
+      <w:lvlText w:val=""/>
+      <w:lvlJc w:val="left"/>
+      <w:pPr>
+        <w:ind w:left="2880" w:hanging="360"/>
+      </w:pPr>
+      <w:rPr>
+        <w:rFonts w:ascii="Symbol" w:hAnsi="Symbol" w:hint="default"/>
+      </w:rPr>
+    </w:lvl>
+    <w:lvl w:ilvl="4" w:tplc="18090003" w:tentative="1">
+      <w:start w:val="1"/>
+      <w:numFmt w:val="bullet"/>
+      <w:lvlText w:val="o"/>
+      <w:lvlJc w:val="left"/>
+      <w:pPr>
+        <w:ind w:left="3600" w:hanging="360"/>
+      </w:pPr>
+      <w:rPr>
+        <w:rFonts w:ascii="Courier New" w:hAnsi="Courier New" w:cs="Courier New" w:hint="default"/>
+      </w:rPr>
+    </w:lvl>
+    <w:lvl w:ilvl="5" w:tplc="18090005" w:tentative="1">
+      <w:start w:val="1"/>
+      <w:numFmt w:val="bullet"/>
+      <w:lvlText w:val=""/>
+      <w:lvlJc w:val="left"/>
+      <w:pPr>
+        <w:ind w:left="4320" w:hanging="360"/>
+      </w:pPr>
+      <w:rPr>
+        <w:rFonts w:ascii="Wingdings" w:hAnsi="Wingdings" w:hint="default"/>
+      </w:rPr>
+    </w:lvl>
+    <w:lvl w:ilvl="6" w:tplc="18090001" w:tentative="1">
+      <w:start w:val="1"/>
+      <w:numFmt w:val="bullet"/>
+      <w:lvlText w:val=""/>
+      <w:lvlJc w:val="left"/>
+      <w:pPr>
+        <w:ind w:left="5040" w:hanging="360"/>
+      </w:pPr>
+      <w:rPr>
+        <w:rFonts w:ascii="Symbol" w:hAnsi="Symbol" w:hint="default"/>
+      </w:rPr>
+    </w:lvl>
+    <w:lvl w:ilvl="7" w:tplc="18090003" w:tentative="1">
+      <w:start w:val="1"/>
+      <w:numFmt w:val="bullet"/>
+      <w:lvlText w:val="o"/>
+      <w:lvlJc w:val="left"/>
+      <w:pPr>
+        <w:ind w:left="5760" w:hanging="360"/>
+      </w:pPr>
+      <w:rPr>
+        <w:rFonts w:ascii="Courier New" w:hAnsi="Courier New" w:cs="Courier New" w:hint="default"/>
+      </w:rPr>
+    </w:lvl>
+    <w:lvl w:ilvl="8" w:tplc="18090005" w:tentative="1">
+      <w:start w:val="1"/>
+      <w:numFmt w:val="bullet"/>
+      <w:lvlText w:val=""/>
+      <w:lvlJc w:val="left"/>
+      <w:pPr>
+        <w:ind w:left="6480" w:hanging="360"/>
+      </w:pPr>
+      <w:rPr>
+        <w:rFonts w:ascii="Wingdings" w:hAnsi="Wingdings" w:hint="default"/>
+      </w:rPr>
+    </w:lvl>
+  </w:abstractNum>
+  <w:abstractNum w:abstractNumId="2" w15:restartNumberingAfterBreak="0">
+    <w:nsid w:val="50326043"/>
+    <w:multiLevelType w:val="hybridMultilevel"/>
+    <w:tmpl w:val="6AA826BA"/>
+    <w:lvl w:ilvl="0" w:tplc="18090003">
+      <w:start w:val="1"/>
+      <w:numFmt w:val="bullet"/>
+      <w:lvlText w:val="o"/>
+      <w:lvlJc w:val="left"/>
+      <w:pPr>
+        <w:ind w:left="1440" w:hanging="360"/>
+      </w:pPr>
+      <w:rPr>
+        <w:rFonts w:ascii="Courier New" w:hAnsi="Courier New" w:cs="Courier New" w:hint="default"/>
+      </w:rPr>
+    </w:lvl>
+    <w:lvl w:ilvl="1" w:tplc="18090003" w:tentative="1">
+      <w:start w:val="1"/>
+      <w:numFmt w:val="bullet"/>
+      <w:lvlText w:val="o"/>
+      <w:lvlJc w:val="left"/>
+      <w:pPr>
+        <w:ind w:left="2160" w:hanging="360"/>
+      </w:pPr>
+      <w:rPr>
+        <w:rFonts w:ascii="Courier New" w:hAnsi="Courier New" w:cs="Courier New" w:hint="default"/>
+      </w:rPr>
+    </w:lvl>
+    <w:lvl w:ilvl="2" w:tplc="18090005" w:tentative="1">
+      <w:start w:val="1"/>
+      <w:numFmt w:val="bullet"/>
+      <w:lvlText w:val=""/>
+      <w:lvlJc w:val="left"/>
+      <w:pPr>
+        <w:ind w:left="2880" w:hanging="360"/>
+      </w:pPr>
+      <w:rPr>
+        <w:rFonts w:ascii="Wingdings" w:hAnsi="Wingdings" w:hint="default"/>
+      </w:rPr>
+    </w:lvl>
+    <w:lvl w:ilvl="3" w:tplc="18090001" w:tentative="1">
+      <w:start w:val="1"/>
+      <w:numFmt w:val="bullet"/>
+      <w:lvlText w:val=""/>
+      <w:lvlJc w:val="left"/>
+      <w:pPr>
+        <w:ind w:left="3600" w:hanging="360"/>
+      </w:pPr>
+      <w:rPr>
+        <w:rFonts w:ascii="Symbol" w:hAnsi="Symbol" w:hint="default"/>
+      </w:rPr>
+    </w:lvl>
+    <w:lvl w:ilvl="4" w:tplc="18090003" w:tentative="1">
+      <w:start w:val="1"/>
+      <w:numFmt w:val="bullet"/>
+      <w:lvlText w:val="o"/>
+      <w:lvlJc w:val="left"/>
+      <w:pPr>
+        <w:ind w:left="4320" w:hanging="360"/>
+      </w:pPr>
+      <w:rPr>
+        <w:rFonts w:ascii="Courier New" w:hAnsi="Courier New" w:cs="Courier New" w:hint="default"/>
+      </w:rPr>
+    </w:lvl>
+    <w:lvl w:ilvl="5" w:tplc="18090005" w:tentative="1">
+      <w:start w:val="1"/>
+      <w:numFmt w:val="bullet"/>
+      <w:lvlText w:val=""/>
+      <w:lvlJc w:val="left"/>
+      <w:pPr>
+        <w:ind w:left="5040" w:hanging="360"/>
+      </w:pPr>
+      <w:rPr>
+        <w:rFonts w:ascii="Wingdings" w:hAnsi="Wingdings" w:hint="default"/>
+      </w:rPr>
+    </w:lvl>
+    <w:lvl w:ilvl="6" w:tplc="18090001" w:tentative="1">
+      <w:start w:val="1"/>
+      <w:numFmt w:val="bullet"/>
+      <w:lvlText w:val=""/>
+      <w:lvlJc w:val="left"/>
+      <w:pPr>
+        <w:ind w:left="5760" w:hanging="360"/>
+      </w:pPr>
+      <w:rPr>
+        <w:rFonts w:ascii="Symbol" w:hAnsi="Symbol" w:hint="default"/>
+      </w:rPr>
+    </w:lvl>
+    <w:lvl w:ilvl="7" w:tplc="18090003" w:tentative="1">
+      <w:start w:val="1"/>
+      <w:numFmt w:val="bullet"/>
+      <w:lvlText w:val="o"/>
+      <w:lvlJc w:val="left"/>
+      <w:pPr>
+        <w:ind w:left="6480" w:hanging="360"/>
+      </w:pPr>
+      <w:rPr>
+        <w:rFonts w:ascii="Courier New" w:hAnsi="Courier New" w:cs="Courier New" w:hint="default"/>
+      </w:rPr>
+    </w:lvl>
+    <w:lvl w:ilvl="8" w:tplc="18090005" w:tentative="1">
+      <w:start w:val="1"/>
+      <w:numFmt w:val="bullet"/>
+      <w:lvlText w:val=""/>
+      <w:lvlJc w:val="left"/>
+      <w:pPr>
+        <w:ind w:left="7200" w:hanging="360"/>
+      </w:pPr>
+      <w:rPr>
+        <w:rFonts w:ascii="Wingdings" w:hAnsi="Wingdings" w:hint="default"/>
+      </w:rPr>
+    </w:lvl>
+  </w:abstractNum>
+  <w:abstractNum w:abstractNumId="3" w15:restartNumberingAfterBreak="0">
     <w:nsid w:val="50BD37DD"/>
     <w:multiLevelType w:val="hybridMultilevel"/>
     <w:tmpl w:val="ED34850C"/>
@@ -344,7 +713,16 @@
     </w:lvl>
   </w:abstractNum>
   <w:num w:numId="1" w16cid:durableId="1161046106">
+    <w:abstractNumId w:val="3"/>
+  </w:num>
+  <w:num w:numId="2" w16cid:durableId="1511484960">
+    <w:abstractNumId w:val="1"/>
+  </w:num>
+  <w:num w:numId="3" w16cid:durableId="334958272">
     <w:abstractNumId w:val="0"/>
+  </w:num>
+  <w:num w:numId="4" w16cid:durableId="2073769165">
+    <w:abstractNumId w:val="2"/>
   </w:num>
 </w:numbering>
 </file>

</xml_diff>

<commit_message>
Implemented playtest 1 feedback and bug fix
</commit_message>
<xml_diff>
--- a/Docs/Playtest 1.docx
+++ b/Docs/Playtest 1.docx
@@ -100,7 +100,21 @@
           <w:sz w:val="24"/>
           <w:szCs w:val="24"/>
         </w:rPr>
-        <w:t>Only show new game warning if save game exists – not on first start.</w:t>
+        <w:t>Only show new game warning if save game exist</w:t>
+      </w:r>
+      <w:r>
+        <w:rPr>
+          <w:sz w:val="24"/>
+          <w:szCs w:val="24"/>
+        </w:rPr>
+        <w:t>s</w:t>
+      </w:r>
+      <w:r>
+        <w:rPr>
+          <w:sz w:val="24"/>
+          <w:szCs w:val="24"/>
+        </w:rPr>
+        <w:t>.</w:t>
       </w:r>
     </w:p>
     <w:p>
@@ -180,7 +194,7 @@
           <w:sz w:val="24"/>
           <w:szCs w:val="24"/>
         </w:rPr>
-        <w:t>Darken non selected party members in party UI. – Found it a bit confusing with just the background colour change.</w:t>
+        <w:t xml:space="preserve">Darken non selected party members in party UI. </w:t>
       </w:r>
     </w:p>
     <w:p>
@@ -209,7 +223,7 @@
           <w:szCs w:val="24"/>
           <w:u w:val="single"/>
         </w:rPr>
-        <w:t>Changes Implemented</w:t>
+        <w:t>Bugs</w:t>
       </w:r>
     </w:p>
     <w:p>
@@ -217,7 +231,7 @@
         <w:pStyle w:val="ListParagraph"/>
         <w:numPr>
           <w:ilvl w:val="0"/>
-          <w:numId w:val="1"/>
+          <w:numId w:val="5"/>
         </w:numPr>
         <w:rPr>
           <w:sz w:val="24"/>
@@ -229,24 +243,231 @@
           <w:sz w:val="24"/>
           <w:szCs w:val="24"/>
         </w:rPr>
+        <w:t>Can interact with party members while they are following.</w:t>
+      </w:r>
+    </w:p>
+    <w:p>
+      <w:pPr>
+        <w:rPr>
+          <w:sz w:val="24"/>
+          <w:szCs w:val="24"/>
+        </w:rPr>
+      </w:pPr>
+    </w:p>
+    <w:p>
+      <w:pPr>
+        <w:rPr>
+          <w:sz w:val="24"/>
+          <w:szCs w:val="24"/>
+        </w:rPr>
+      </w:pPr>
+      <w:r>
+        <w:rPr>
+          <w:b/>
+          <w:bCs/>
+          <w:sz w:val="24"/>
+          <w:szCs w:val="24"/>
+          <w:u w:val="single"/>
+        </w:rPr>
+        <w:t>Changes Implemented</w:t>
+      </w:r>
+    </w:p>
+    <w:p>
+      <w:pPr>
+        <w:pStyle w:val="ListParagraph"/>
+        <w:numPr>
+          <w:ilvl w:val="0"/>
+          <w:numId w:val="5"/>
+        </w:numPr>
+        <w:rPr>
+          <w:sz w:val="24"/>
+          <w:szCs w:val="24"/>
+        </w:rPr>
+      </w:pPr>
+      <w:r>
+        <w:rPr>
+          <w:sz w:val="24"/>
+          <w:szCs w:val="24"/>
+        </w:rPr>
+        <w:t xml:space="preserve">Increased </w:t>
+      </w:r>
+      <w:r>
+        <w:rPr>
+          <w:sz w:val="24"/>
+          <w:szCs w:val="24"/>
+        </w:rPr>
+        <w:t>hamster</w:t>
+      </w:r>
+      <w:r>
+        <w:rPr>
+          <w:sz w:val="24"/>
+          <w:szCs w:val="24"/>
+        </w:rPr>
+        <w:t>’</w:t>
+      </w:r>
+      <w:r>
+        <w:rPr>
+          <w:sz w:val="24"/>
+          <w:szCs w:val="24"/>
+        </w:rPr>
+        <w:t>s</w:t>
+      </w:r>
+      <w:r>
+        <w:rPr>
+          <w:sz w:val="24"/>
+          <w:szCs w:val="24"/>
+        </w:rPr>
+        <w:t xml:space="preserve"> jump force and gravity scale to create a better feeling jump – less floaty.</w:t>
+      </w:r>
+    </w:p>
+    <w:p>
+      <w:pPr>
+        <w:pStyle w:val="ListParagraph"/>
+        <w:numPr>
+          <w:ilvl w:val="0"/>
+          <w:numId w:val="5"/>
+        </w:numPr>
+        <w:rPr>
+          <w:sz w:val="24"/>
+          <w:szCs w:val="24"/>
+        </w:rPr>
+      </w:pPr>
+      <w:r>
+        <w:rPr>
+          <w:sz w:val="24"/>
+          <w:szCs w:val="24"/>
+        </w:rPr>
+        <w:t>New game warning now checks if it’s the first time starting a game before warning player about losing their save game data.</w:t>
+      </w:r>
+    </w:p>
+    <w:p>
+      <w:pPr>
+        <w:pStyle w:val="ListParagraph"/>
+        <w:numPr>
+          <w:ilvl w:val="0"/>
+          <w:numId w:val="5"/>
+        </w:numPr>
+        <w:rPr>
+          <w:sz w:val="24"/>
+          <w:szCs w:val="24"/>
+        </w:rPr>
+      </w:pPr>
+      <w:r>
+        <w:rPr>
+          <w:sz w:val="24"/>
+          <w:szCs w:val="24"/>
+        </w:rPr>
+        <w:t>Made Q, E and arrow images in tab menu into buttons.</w:t>
+      </w:r>
+    </w:p>
+    <w:p>
+      <w:pPr>
+        <w:pStyle w:val="ListParagraph"/>
+        <w:numPr>
+          <w:ilvl w:val="0"/>
+          <w:numId w:val="5"/>
+        </w:numPr>
+        <w:rPr>
+          <w:sz w:val="24"/>
+          <w:szCs w:val="24"/>
+        </w:rPr>
+      </w:pPr>
+      <w:r>
+        <w:rPr>
+          <w:sz w:val="24"/>
+          <w:szCs w:val="24"/>
+        </w:rPr>
+        <w:t>Dialogue can now be continued with either the enter key or left mouse click.</w:t>
+      </w:r>
+    </w:p>
+    <w:p>
+      <w:pPr>
+        <w:pStyle w:val="ListParagraph"/>
+        <w:numPr>
+          <w:ilvl w:val="0"/>
+          <w:numId w:val="5"/>
+        </w:numPr>
+        <w:rPr>
+          <w:sz w:val="24"/>
+          <w:szCs w:val="24"/>
+        </w:rPr>
+      </w:pPr>
+      <w:r>
+        <w:rPr>
+          <w:sz w:val="24"/>
+          <w:szCs w:val="24"/>
+        </w:rPr>
         <w:t>Inventory slots can now be navigated and selected using the WASD keys.</w:t>
       </w:r>
     </w:p>
     <w:p>
       <w:pPr>
-        <w:rPr>
-          <w:sz w:val="24"/>
-          <w:szCs w:val="24"/>
-        </w:rPr>
-      </w:pPr>
-    </w:p>
-    <w:p>
-      <w:pPr>
-        <w:rPr>
-          <w:sz w:val="24"/>
-          <w:szCs w:val="24"/>
-        </w:rPr>
-      </w:pPr>
+        <w:pStyle w:val="ListParagraph"/>
+        <w:numPr>
+          <w:ilvl w:val="0"/>
+          <w:numId w:val="5"/>
+        </w:numPr>
+        <w:rPr>
+          <w:sz w:val="24"/>
+          <w:szCs w:val="24"/>
+        </w:rPr>
+      </w:pPr>
+      <w:r>
+        <w:rPr>
+          <w:sz w:val="24"/>
+          <w:szCs w:val="24"/>
+        </w:rPr>
+        <w:t>Selected party member now more clear.</w:t>
+      </w:r>
+    </w:p>
+    <w:p>
+      <w:pPr>
+        <w:rPr>
+          <w:sz w:val="24"/>
+          <w:szCs w:val="24"/>
+        </w:rPr>
+      </w:pPr>
+    </w:p>
+    <w:p>
+      <w:pPr>
+        <w:rPr>
+          <w:b/>
+          <w:bCs/>
+          <w:sz w:val="24"/>
+          <w:szCs w:val="24"/>
+          <w:u w:val="single"/>
+        </w:rPr>
+      </w:pPr>
+      <w:r>
+        <w:rPr>
+          <w:b/>
+          <w:bCs/>
+          <w:sz w:val="24"/>
+          <w:szCs w:val="24"/>
+          <w:u w:val="single"/>
+        </w:rPr>
+        <w:t>Bug Fixes</w:t>
+      </w:r>
+    </w:p>
+    <w:p>
+      <w:pPr>
+        <w:pStyle w:val="ListParagraph"/>
+        <w:numPr>
+          <w:ilvl w:val="0"/>
+          <w:numId w:val="6"/>
+        </w:numPr>
+        <w:rPr>
+          <w:sz w:val="24"/>
+          <w:szCs w:val="24"/>
+        </w:rPr>
+      </w:pPr>
+      <w:r>
+        <w:rPr>
+          <w:sz w:val="24"/>
+          <w:szCs w:val="24"/>
+        </w:rPr>
+        <w:t>Make dialogue manager unselect party member when they start following.</w:t>
+      </w:r>
     </w:p>
     <w:p>
       <w:pPr>
@@ -511,6 +732,119 @@
     </w:lvl>
   </w:abstractNum>
   <w:abstractNum w:abstractNumId="2" w15:restartNumberingAfterBreak="0">
+    <w:nsid w:val="2B2F52C2"/>
+    <w:multiLevelType w:val="hybridMultilevel"/>
+    <w:tmpl w:val="375AC1F4"/>
+    <w:lvl w:ilvl="0" w:tplc="18090001">
+      <w:start w:val="1"/>
+      <w:numFmt w:val="bullet"/>
+      <w:lvlText w:val=""/>
+      <w:lvlJc w:val="left"/>
+      <w:pPr>
+        <w:ind w:left="720" w:hanging="360"/>
+      </w:pPr>
+      <w:rPr>
+        <w:rFonts w:ascii="Symbol" w:hAnsi="Symbol" w:hint="default"/>
+      </w:rPr>
+    </w:lvl>
+    <w:lvl w:ilvl="1" w:tplc="18090003" w:tentative="1">
+      <w:start w:val="1"/>
+      <w:numFmt w:val="bullet"/>
+      <w:lvlText w:val="o"/>
+      <w:lvlJc w:val="left"/>
+      <w:pPr>
+        <w:ind w:left="1440" w:hanging="360"/>
+      </w:pPr>
+      <w:rPr>
+        <w:rFonts w:ascii="Courier New" w:hAnsi="Courier New" w:cs="Courier New" w:hint="default"/>
+      </w:rPr>
+    </w:lvl>
+    <w:lvl w:ilvl="2" w:tplc="18090005" w:tentative="1">
+      <w:start w:val="1"/>
+      <w:numFmt w:val="bullet"/>
+      <w:lvlText w:val=""/>
+      <w:lvlJc w:val="left"/>
+      <w:pPr>
+        <w:ind w:left="2160" w:hanging="360"/>
+      </w:pPr>
+      <w:rPr>
+        <w:rFonts w:ascii="Wingdings" w:hAnsi="Wingdings" w:hint="default"/>
+      </w:rPr>
+    </w:lvl>
+    <w:lvl w:ilvl="3" w:tplc="18090001" w:tentative="1">
+      <w:start w:val="1"/>
+      <w:numFmt w:val="bullet"/>
+      <w:lvlText w:val=""/>
+      <w:lvlJc w:val="left"/>
+      <w:pPr>
+        <w:ind w:left="2880" w:hanging="360"/>
+      </w:pPr>
+      <w:rPr>
+        <w:rFonts w:ascii="Symbol" w:hAnsi="Symbol" w:hint="default"/>
+      </w:rPr>
+    </w:lvl>
+    <w:lvl w:ilvl="4" w:tplc="18090003" w:tentative="1">
+      <w:start w:val="1"/>
+      <w:numFmt w:val="bullet"/>
+      <w:lvlText w:val="o"/>
+      <w:lvlJc w:val="left"/>
+      <w:pPr>
+        <w:ind w:left="3600" w:hanging="360"/>
+      </w:pPr>
+      <w:rPr>
+        <w:rFonts w:ascii="Courier New" w:hAnsi="Courier New" w:cs="Courier New" w:hint="default"/>
+      </w:rPr>
+    </w:lvl>
+    <w:lvl w:ilvl="5" w:tplc="18090005" w:tentative="1">
+      <w:start w:val="1"/>
+      <w:numFmt w:val="bullet"/>
+      <w:lvlText w:val=""/>
+      <w:lvlJc w:val="left"/>
+      <w:pPr>
+        <w:ind w:left="4320" w:hanging="360"/>
+      </w:pPr>
+      <w:rPr>
+        <w:rFonts w:ascii="Wingdings" w:hAnsi="Wingdings" w:hint="default"/>
+      </w:rPr>
+    </w:lvl>
+    <w:lvl w:ilvl="6" w:tplc="18090001" w:tentative="1">
+      <w:start w:val="1"/>
+      <w:numFmt w:val="bullet"/>
+      <w:lvlText w:val=""/>
+      <w:lvlJc w:val="left"/>
+      <w:pPr>
+        <w:ind w:left="5040" w:hanging="360"/>
+      </w:pPr>
+      <w:rPr>
+        <w:rFonts w:ascii="Symbol" w:hAnsi="Symbol" w:hint="default"/>
+      </w:rPr>
+    </w:lvl>
+    <w:lvl w:ilvl="7" w:tplc="18090003" w:tentative="1">
+      <w:start w:val="1"/>
+      <w:numFmt w:val="bullet"/>
+      <w:lvlText w:val="o"/>
+      <w:lvlJc w:val="left"/>
+      <w:pPr>
+        <w:ind w:left="5760" w:hanging="360"/>
+      </w:pPr>
+      <w:rPr>
+        <w:rFonts w:ascii="Courier New" w:hAnsi="Courier New" w:cs="Courier New" w:hint="default"/>
+      </w:rPr>
+    </w:lvl>
+    <w:lvl w:ilvl="8" w:tplc="18090005" w:tentative="1">
+      <w:start w:val="1"/>
+      <w:numFmt w:val="bullet"/>
+      <w:lvlText w:val=""/>
+      <w:lvlJc w:val="left"/>
+      <w:pPr>
+        <w:ind w:left="6480" w:hanging="360"/>
+      </w:pPr>
+      <w:rPr>
+        <w:rFonts w:ascii="Wingdings" w:hAnsi="Wingdings" w:hint="default"/>
+      </w:rPr>
+    </w:lvl>
+  </w:abstractNum>
+  <w:abstractNum w:abstractNumId="3" w15:restartNumberingAfterBreak="0">
     <w:nsid w:val="50326043"/>
     <w:multiLevelType w:val="hybridMultilevel"/>
     <w:tmpl w:val="6AA826BA"/>
@@ -623,7 +957,7 @@
       </w:rPr>
     </w:lvl>
   </w:abstractNum>
-  <w:abstractNum w:abstractNumId="3" w15:restartNumberingAfterBreak="0">
+  <w:abstractNum w:abstractNumId="4" w15:restartNumberingAfterBreak="0">
     <w:nsid w:val="50BD37DD"/>
     <w:multiLevelType w:val="hybridMultilevel"/>
     <w:tmpl w:val="ED34850C"/>
@@ -712,8 +1046,121 @@
       </w:pPr>
     </w:lvl>
   </w:abstractNum>
+  <w:abstractNum w:abstractNumId="5" w15:restartNumberingAfterBreak="0">
+    <w:nsid w:val="780F20F6"/>
+    <w:multiLevelType w:val="hybridMultilevel"/>
+    <w:tmpl w:val="E8966ED0"/>
+    <w:lvl w:ilvl="0" w:tplc="18090001">
+      <w:start w:val="1"/>
+      <w:numFmt w:val="bullet"/>
+      <w:lvlText w:val=""/>
+      <w:lvlJc w:val="left"/>
+      <w:pPr>
+        <w:ind w:left="720" w:hanging="360"/>
+      </w:pPr>
+      <w:rPr>
+        <w:rFonts w:ascii="Symbol" w:hAnsi="Symbol" w:hint="default"/>
+      </w:rPr>
+    </w:lvl>
+    <w:lvl w:ilvl="1" w:tplc="18090003" w:tentative="1">
+      <w:start w:val="1"/>
+      <w:numFmt w:val="bullet"/>
+      <w:lvlText w:val="o"/>
+      <w:lvlJc w:val="left"/>
+      <w:pPr>
+        <w:ind w:left="1440" w:hanging="360"/>
+      </w:pPr>
+      <w:rPr>
+        <w:rFonts w:ascii="Courier New" w:hAnsi="Courier New" w:cs="Courier New" w:hint="default"/>
+      </w:rPr>
+    </w:lvl>
+    <w:lvl w:ilvl="2" w:tplc="18090005" w:tentative="1">
+      <w:start w:val="1"/>
+      <w:numFmt w:val="bullet"/>
+      <w:lvlText w:val=""/>
+      <w:lvlJc w:val="left"/>
+      <w:pPr>
+        <w:ind w:left="2160" w:hanging="360"/>
+      </w:pPr>
+      <w:rPr>
+        <w:rFonts w:ascii="Wingdings" w:hAnsi="Wingdings" w:hint="default"/>
+      </w:rPr>
+    </w:lvl>
+    <w:lvl w:ilvl="3" w:tplc="18090001" w:tentative="1">
+      <w:start w:val="1"/>
+      <w:numFmt w:val="bullet"/>
+      <w:lvlText w:val=""/>
+      <w:lvlJc w:val="left"/>
+      <w:pPr>
+        <w:ind w:left="2880" w:hanging="360"/>
+      </w:pPr>
+      <w:rPr>
+        <w:rFonts w:ascii="Symbol" w:hAnsi="Symbol" w:hint="default"/>
+      </w:rPr>
+    </w:lvl>
+    <w:lvl w:ilvl="4" w:tplc="18090003" w:tentative="1">
+      <w:start w:val="1"/>
+      <w:numFmt w:val="bullet"/>
+      <w:lvlText w:val="o"/>
+      <w:lvlJc w:val="left"/>
+      <w:pPr>
+        <w:ind w:left="3600" w:hanging="360"/>
+      </w:pPr>
+      <w:rPr>
+        <w:rFonts w:ascii="Courier New" w:hAnsi="Courier New" w:cs="Courier New" w:hint="default"/>
+      </w:rPr>
+    </w:lvl>
+    <w:lvl w:ilvl="5" w:tplc="18090005" w:tentative="1">
+      <w:start w:val="1"/>
+      <w:numFmt w:val="bullet"/>
+      <w:lvlText w:val=""/>
+      <w:lvlJc w:val="left"/>
+      <w:pPr>
+        <w:ind w:left="4320" w:hanging="360"/>
+      </w:pPr>
+      <w:rPr>
+        <w:rFonts w:ascii="Wingdings" w:hAnsi="Wingdings" w:hint="default"/>
+      </w:rPr>
+    </w:lvl>
+    <w:lvl w:ilvl="6" w:tplc="18090001" w:tentative="1">
+      <w:start w:val="1"/>
+      <w:numFmt w:val="bullet"/>
+      <w:lvlText w:val=""/>
+      <w:lvlJc w:val="left"/>
+      <w:pPr>
+        <w:ind w:left="5040" w:hanging="360"/>
+      </w:pPr>
+      <w:rPr>
+        <w:rFonts w:ascii="Symbol" w:hAnsi="Symbol" w:hint="default"/>
+      </w:rPr>
+    </w:lvl>
+    <w:lvl w:ilvl="7" w:tplc="18090003" w:tentative="1">
+      <w:start w:val="1"/>
+      <w:numFmt w:val="bullet"/>
+      <w:lvlText w:val="o"/>
+      <w:lvlJc w:val="left"/>
+      <w:pPr>
+        <w:ind w:left="5760" w:hanging="360"/>
+      </w:pPr>
+      <w:rPr>
+        <w:rFonts w:ascii="Courier New" w:hAnsi="Courier New" w:cs="Courier New" w:hint="default"/>
+      </w:rPr>
+    </w:lvl>
+    <w:lvl w:ilvl="8" w:tplc="18090005" w:tentative="1">
+      <w:start w:val="1"/>
+      <w:numFmt w:val="bullet"/>
+      <w:lvlText w:val=""/>
+      <w:lvlJc w:val="left"/>
+      <w:pPr>
+        <w:ind w:left="6480" w:hanging="360"/>
+      </w:pPr>
+      <w:rPr>
+        <w:rFonts w:ascii="Wingdings" w:hAnsi="Wingdings" w:hint="default"/>
+      </w:rPr>
+    </w:lvl>
+  </w:abstractNum>
   <w:num w:numId="1" w16cid:durableId="1161046106">
-    <w:abstractNumId w:val="3"/>
+    <w:abstractNumId w:val="4"/>
   </w:num>
   <w:num w:numId="2" w16cid:durableId="1511484960">
     <w:abstractNumId w:val="1"/>
@@ -722,6 +1169,12 @@
     <w:abstractNumId w:val="0"/>
   </w:num>
   <w:num w:numId="4" w16cid:durableId="2073769165">
+    <w:abstractNumId w:val="3"/>
+  </w:num>
+  <w:num w:numId="5" w16cid:durableId="1955357561">
+    <w:abstractNumId w:val="5"/>
+  </w:num>
+  <w:num w:numId="6" w16cid:durableId="1292133827">
     <w:abstractNumId w:val="2"/>
   </w:num>
 </w:numbering>

</xml_diff>